<commit_message>
Add Use case spec and ERD
</commit_message>
<xml_diff>
--- a/docs/BloodBank_Functional_Requirements.docx
+++ b/docs/BloodBank_Functional_Requirements.docx
@@ -801,8 +801,1368 @@
     <w:p>
       <w:pPr>
         <w:pStyle w:val="Heading1"/>
+        <w:keepNext/>
         <w:pageBreakBefore/>
-        <w:spacing w:after="160"/>
+      </w:pPr>
+      <w:r>
+        <w:t>High-level requirements</w:t>
+      </w:r>
+    </w:p>
+    <w:p>
+      <w:pPr>
+        <w:keepNext/>
+        <w:spacing w:after="180"/>
+      </w:pPr>
+      <w:r>
+        <w:t>The table groups the detailed functional requirements by the work they support. Each FR remains fully defined in the table that follows.</w:t>
+      </w:r>
+    </w:p>
+    <w:tbl>
+      <w:tblPr>
+        <w:tblStyle w:val="TableGrid"/>
+        <w:tblW w:type="auto" w:w="0"/>
+        <w:tblLayout w:type="fixed"/>
+        <w:tblLook w:firstColumn="1" w:firstRow="1" w:lastColumn="0" w:lastRow="0" w:noHBand="0" w:noVBand="1" w:val="04A0"/>
+      </w:tblPr>
+      <w:tblGrid>
+        <w:gridCol w:w="1094"/>
+        <w:gridCol w:w="2952"/>
+        <w:gridCol w:w="8842"/>
+        <w:gridCol w:w="1944"/>
+      </w:tblGrid>
+      <w:tr>
+        <w:trPr>
+          <w:tblHeader w:val="true"/>
+        </w:trPr>
+        <w:tc>
+          <w:tcPr>
+            <w:tcW w:type="dxa" w:w="1094"/>
+            <w:vAlign w:val="center"/>
+            <w:shd w:fill="233B56"/>
+            <w:tcMar>
+              <w:top w:w="80" w:type="dxa"/>
+              <w:left w:w="85" w:type="dxa"/>
+              <w:bottom w:w="80" w:type="dxa"/>
+              <w:right w:w="85" w:type="dxa"/>
+            </w:tcMar>
+            <w:tcBorders>
+              <w:top w:val="single" w:sz="4" w:color="D9D9D9"/>
+              <w:left w:val="single" w:sz="4" w:color="D9D9D9"/>
+              <w:bottom w:val="single" w:sz="4" w:color="D9D9D9"/>
+              <w:right w:val="single" w:sz="4" w:color="D9D9D9"/>
+            </w:tcBorders>
+          </w:tcPr>
+          <w:p>
+            <w:pPr>
+              <w:jc w:val="center"/>
+            </w:pPr>
+            <w:r>
+              <w:rPr>
+                <w:rFonts w:ascii="Aptos" w:hAnsi="Aptos"/>
+                <w:b/>
+                <w:color w:val="FFFFFF"/>
+                <w:sz w:val="17"/>
+              </w:rPr>
+              <w:t>ID</w:t>
+            </w:r>
+          </w:p>
+        </w:tc>
+        <w:tc>
+          <w:tcPr>
+            <w:tcW w:type="dxa" w:w="2952"/>
+            <w:vAlign w:val="center"/>
+            <w:shd w:fill="233B56"/>
+            <w:tcMar>
+              <w:top w:w="80" w:type="dxa"/>
+              <w:left w:w="85" w:type="dxa"/>
+              <w:bottom w:w="80" w:type="dxa"/>
+              <w:right w:w="85" w:type="dxa"/>
+            </w:tcMar>
+            <w:tcBorders>
+              <w:top w:val="single" w:sz="4" w:color="D9D9D9"/>
+              <w:left w:val="single" w:sz="4" w:color="D9D9D9"/>
+              <w:bottom w:val="single" w:sz="4" w:color="D9D9D9"/>
+              <w:right w:val="single" w:sz="4" w:color="D9D9D9"/>
+            </w:tcBorders>
+          </w:tcPr>
+          <w:p>
+            <w:r>
+              <w:rPr>
+                <w:rFonts w:ascii="Aptos" w:hAnsi="Aptos"/>
+                <w:b/>
+                <w:color w:val="FFFFFF"/>
+                <w:sz w:val="17"/>
+              </w:rPr>
+              <w:t>Title</w:t>
+            </w:r>
+          </w:p>
+        </w:tc>
+        <w:tc>
+          <w:tcPr>
+            <w:tcW w:type="dxa" w:w="8842"/>
+            <w:vAlign w:val="center"/>
+            <w:shd w:fill="233B56"/>
+            <w:tcMar>
+              <w:top w:w="80" w:type="dxa"/>
+              <w:left w:w="85" w:type="dxa"/>
+              <w:bottom w:w="80" w:type="dxa"/>
+              <w:right w:w="85" w:type="dxa"/>
+            </w:tcMar>
+            <w:tcBorders>
+              <w:top w:val="single" w:sz="4" w:color="D9D9D9"/>
+              <w:left w:val="single" w:sz="4" w:color="D9D9D9"/>
+              <w:bottom w:val="single" w:sz="4" w:color="D9D9D9"/>
+              <w:right w:val="single" w:sz="4" w:color="D9D9D9"/>
+            </w:tcBorders>
+          </w:tcPr>
+          <w:p>
+            <w:r>
+              <w:rPr>
+                <w:rFonts w:ascii="Aptos" w:hAnsi="Aptos"/>
+                <w:b/>
+                <w:color w:val="FFFFFF"/>
+                <w:sz w:val="17"/>
+              </w:rPr>
+              <w:t>High-level requirement</w:t>
+            </w:r>
+          </w:p>
+        </w:tc>
+        <w:tc>
+          <w:tcPr>
+            <w:tcW w:type="dxa" w:w="1944"/>
+            <w:vAlign w:val="center"/>
+            <w:shd w:fill="233B56"/>
+            <w:tcMar>
+              <w:top w:w="80" w:type="dxa"/>
+              <w:left w:w="85" w:type="dxa"/>
+              <w:bottom w:w="80" w:type="dxa"/>
+              <w:right w:w="85" w:type="dxa"/>
+            </w:tcMar>
+            <w:tcBorders>
+              <w:top w:val="single" w:sz="4" w:color="D9D9D9"/>
+              <w:left w:val="single" w:sz="4" w:color="D9D9D9"/>
+              <w:bottom w:val="single" w:sz="4" w:color="D9D9D9"/>
+              <w:right w:val="single" w:sz="4" w:color="D9D9D9"/>
+            </w:tcBorders>
+          </w:tcPr>
+          <w:p>
+            <w:pPr>
+              <w:jc w:val="center"/>
+            </w:pPr>
+            <w:r>
+              <w:rPr>
+                <w:rFonts w:ascii="Aptos" w:hAnsi="Aptos"/>
+                <w:b/>
+                <w:color w:val="FFFFFF"/>
+                <w:sz w:val="17"/>
+              </w:rPr>
+              <w:t>Detailed FRs</w:t>
+            </w:r>
+          </w:p>
+        </w:tc>
+      </w:tr>
+      <w:tr>
+        <w:trPr>
+          <w:cantSplit/>
+        </w:trPr>
+        <w:tc>
+          <w:tcPr>
+            <w:tcW w:type="dxa" w:w="1094"/>
+            <w:vAlign w:val="center"/>
+            <w:tcMar>
+              <w:top w:w="80" w:type="dxa"/>
+              <w:left w:w="85" w:type="dxa"/>
+              <w:bottom w:w="80" w:type="dxa"/>
+              <w:right w:w="85" w:type="dxa"/>
+            </w:tcMar>
+            <w:tcBorders>
+              <w:top w:val="single" w:sz="4" w:color="D9D9D9"/>
+              <w:left w:val="single" w:sz="4" w:color="D9D9D9"/>
+              <w:bottom w:val="single" w:sz="4" w:color="D9D9D9"/>
+              <w:right w:val="single" w:sz="4" w:color="D9D9D9"/>
+            </w:tcBorders>
+          </w:tcPr>
+          <w:p>
+            <w:pPr>
+              <w:spacing w:after="0"/>
+              <w:jc w:val="center"/>
+            </w:pPr>
+            <w:r>
+              <w:rPr>
+                <w:rFonts w:ascii="Aptos" w:hAnsi="Aptos"/>
+                <w:color w:val="000000"/>
+                <w:sz w:val="17"/>
+              </w:rPr>
+              <w:t>HLR-01</w:t>
+            </w:r>
+          </w:p>
+        </w:tc>
+        <w:tc>
+          <w:tcPr>
+            <w:tcW w:type="dxa" w:w="2952"/>
+            <w:vAlign w:val="center"/>
+            <w:tcMar>
+              <w:top w:w="80" w:type="dxa"/>
+              <w:left w:w="85" w:type="dxa"/>
+              <w:bottom w:w="80" w:type="dxa"/>
+              <w:right w:w="85" w:type="dxa"/>
+            </w:tcMar>
+            <w:tcBorders>
+              <w:top w:val="single" w:sz="4" w:color="D9D9D9"/>
+              <w:left w:val="single" w:sz="4" w:color="D9D9D9"/>
+              <w:bottom w:val="single" w:sz="4" w:color="D9D9D9"/>
+              <w:right w:val="single" w:sz="4" w:color="D9D9D9"/>
+            </w:tcBorders>
+          </w:tcPr>
+          <w:p>
+            <w:pPr>
+              <w:spacing w:after="0"/>
+            </w:pPr>
+            <w:r>
+              <w:rPr>
+                <w:rFonts w:ascii="Aptos" w:hAnsi="Aptos"/>
+                <w:color w:val="000000"/>
+                <w:sz w:val="17"/>
+              </w:rPr>
+              <w:t>Organizations</w:t>
+            </w:r>
+          </w:p>
+        </w:tc>
+        <w:tc>
+          <w:tcPr>
+            <w:tcW w:type="dxa" w:w="8842"/>
+            <w:vAlign w:val="center"/>
+            <w:tcMar>
+              <w:top w:w="80" w:type="dxa"/>
+              <w:left w:w="85" w:type="dxa"/>
+              <w:bottom w:w="80" w:type="dxa"/>
+              <w:right w:w="85" w:type="dxa"/>
+            </w:tcMar>
+            <w:tcBorders>
+              <w:top w:val="single" w:sz="4" w:color="D9D9D9"/>
+              <w:left w:val="single" w:sz="4" w:color="D9D9D9"/>
+              <w:bottom w:val="single" w:sz="4" w:color="D9D9D9"/>
+              <w:right w:val="single" w:sz="4" w:color="D9D9D9"/>
+            </w:tcBorders>
+          </w:tcPr>
+          <w:p>
+            <w:pPr>
+              <w:spacing w:after="0"/>
+            </w:pPr>
+            <w:r>
+              <w:rPr>
+                <w:rFonts w:ascii="Aptos" w:hAnsi="Aptos"/>
+                <w:color w:val="000000"/>
+                <w:sz w:val="17"/>
+              </w:rPr>
+              <w:t>The platform shall register blood banks and hospitals so staff and requests belong to the correct organizations.</w:t>
+            </w:r>
+          </w:p>
+        </w:tc>
+        <w:tc>
+          <w:tcPr>
+            <w:tcW w:type="dxa" w:w="1944"/>
+            <w:vAlign w:val="center"/>
+            <w:tcMar>
+              <w:top w:w="80" w:type="dxa"/>
+              <w:left w:w="85" w:type="dxa"/>
+              <w:bottom w:w="80" w:type="dxa"/>
+              <w:right w:w="85" w:type="dxa"/>
+            </w:tcMar>
+            <w:tcBorders>
+              <w:top w:val="single" w:sz="4" w:color="D9D9D9"/>
+              <w:left w:val="single" w:sz="4" w:color="D9D9D9"/>
+              <w:bottom w:val="single" w:sz="4" w:color="D9D9D9"/>
+              <w:right w:val="single" w:sz="4" w:color="D9D9D9"/>
+            </w:tcBorders>
+          </w:tcPr>
+          <w:p>
+            <w:pPr>
+              <w:spacing w:after="0"/>
+              <w:jc w:val="center"/>
+            </w:pPr>
+            <w:r>
+              <w:rPr>
+                <w:rFonts w:ascii="Aptos" w:hAnsi="Aptos"/>
+                <w:color w:val="000000"/>
+                <w:sz w:val="17"/>
+              </w:rPr>
+              <w:t>FR-01 to FR-02</w:t>
+            </w:r>
+          </w:p>
+        </w:tc>
+      </w:tr>
+      <w:tr>
+        <w:trPr>
+          <w:cantSplit/>
+        </w:trPr>
+        <w:tc>
+          <w:tcPr>
+            <w:tcW w:type="dxa" w:w="1094"/>
+            <w:vAlign w:val="center"/>
+            <w:shd w:fill="F2F6FA"/>
+            <w:tcMar>
+              <w:top w:w="80" w:type="dxa"/>
+              <w:left w:w="85" w:type="dxa"/>
+              <w:bottom w:w="80" w:type="dxa"/>
+              <w:right w:w="85" w:type="dxa"/>
+            </w:tcMar>
+            <w:tcBorders>
+              <w:top w:val="single" w:sz="4" w:color="D9D9D9"/>
+              <w:left w:val="single" w:sz="4" w:color="D9D9D9"/>
+              <w:bottom w:val="single" w:sz="4" w:color="D9D9D9"/>
+              <w:right w:val="single" w:sz="4" w:color="D9D9D9"/>
+            </w:tcBorders>
+          </w:tcPr>
+          <w:p>
+            <w:pPr>
+              <w:spacing w:after="0"/>
+              <w:jc w:val="center"/>
+            </w:pPr>
+            <w:r>
+              <w:rPr>
+                <w:rFonts w:ascii="Aptos" w:hAnsi="Aptos"/>
+                <w:color w:val="000000"/>
+                <w:sz w:val="17"/>
+              </w:rPr>
+              <w:t>HLR-02</w:t>
+            </w:r>
+          </w:p>
+        </w:tc>
+        <w:tc>
+          <w:tcPr>
+            <w:tcW w:type="dxa" w:w="2952"/>
+            <w:vAlign w:val="center"/>
+            <w:shd w:fill="F2F6FA"/>
+            <w:tcMar>
+              <w:top w:w="80" w:type="dxa"/>
+              <w:left w:w="85" w:type="dxa"/>
+              <w:bottom w:w="80" w:type="dxa"/>
+              <w:right w:w="85" w:type="dxa"/>
+            </w:tcMar>
+            <w:tcBorders>
+              <w:top w:val="single" w:sz="4" w:color="D9D9D9"/>
+              <w:left w:val="single" w:sz="4" w:color="D9D9D9"/>
+              <w:bottom w:val="single" w:sz="4" w:color="D9D9D9"/>
+              <w:right w:val="single" w:sz="4" w:color="D9D9D9"/>
+            </w:tcBorders>
+          </w:tcPr>
+          <w:p>
+            <w:pPr>
+              <w:spacing w:after="0"/>
+            </w:pPr>
+            <w:r>
+              <w:rPr>
+                <w:rFonts w:ascii="Aptos" w:hAnsi="Aptos"/>
+                <w:color w:val="000000"/>
+                <w:sz w:val="17"/>
+              </w:rPr>
+              <w:t>Staff accounts and access</w:t>
+            </w:r>
+          </w:p>
+        </w:tc>
+        <w:tc>
+          <w:tcPr>
+            <w:tcW w:type="dxa" w:w="8842"/>
+            <w:vAlign w:val="center"/>
+            <w:shd w:fill="F2F6FA"/>
+            <w:tcMar>
+              <w:top w:w="80" w:type="dxa"/>
+              <w:left w:w="85" w:type="dxa"/>
+              <w:bottom w:w="80" w:type="dxa"/>
+              <w:right w:w="85" w:type="dxa"/>
+            </w:tcMar>
+            <w:tcBorders>
+              <w:top w:val="single" w:sz="4" w:color="D9D9D9"/>
+              <w:left w:val="single" w:sz="4" w:color="D9D9D9"/>
+              <w:bottom w:val="single" w:sz="4" w:color="D9D9D9"/>
+              <w:right w:val="single" w:sz="4" w:color="D9D9D9"/>
+            </w:tcBorders>
+          </w:tcPr>
+          <w:p>
+            <w:pPr>
+              <w:spacing w:after="0"/>
+            </w:pPr>
+            <w:r>
+              <w:rPr>
+                <w:rFonts w:ascii="Aptos" w:hAnsi="Aptos"/>
+                <w:color w:val="000000"/>
+                <w:sz w:val="17"/>
+              </w:rPr>
+              <w:t>The platform shall support staff account oversight, bank staff registration and assignment, and authorized sign-in.</w:t>
+            </w:r>
+          </w:p>
+        </w:tc>
+        <w:tc>
+          <w:tcPr>
+            <w:tcW w:type="dxa" w:w="1944"/>
+            <w:vAlign w:val="center"/>
+            <w:shd w:fill="F2F6FA"/>
+            <w:tcMar>
+              <w:top w:w="80" w:type="dxa"/>
+              <w:left w:w="85" w:type="dxa"/>
+              <w:bottom w:w="80" w:type="dxa"/>
+              <w:right w:w="85" w:type="dxa"/>
+            </w:tcMar>
+            <w:tcBorders>
+              <w:top w:val="single" w:sz="4" w:color="D9D9D9"/>
+              <w:left w:val="single" w:sz="4" w:color="D9D9D9"/>
+              <w:bottom w:val="single" w:sz="4" w:color="D9D9D9"/>
+              <w:right w:val="single" w:sz="4" w:color="D9D9D9"/>
+            </w:tcBorders>
+          </w:tcPr>
+          <w:p>
+            <w:pPr>
+              <w:spacing w:after="0"/>
+              <w:jc w:val="center"/>
+            </w:pPr>
+            <w:r>
+              <w:rPr>
+                <w:rFonts w:ascii="Aptos" w:hAnsi="Aptos"/>
+                <w:color w:val="000000"/>
+                <w:sz w:val="17"/>
+              </w:rPr>
+              <w:t>FR-03 to FR-07</w:t>
+            </w:r>
+          </w:p>
+        </w:tc>
+      </w:tr>
+      <w:tr>
+        <w:trPr>
+          <w:cantSplit/>
+        </w:trPr>
+        <w:tc>
+          <w:tcPr>
+            <w:tcW w:type="dxa" w:w="1094"/>
+            <w:vAlign w:val="center"/>
+            <w:tcMar>
+              <w:top w:w="80" w:type="dxa"/>
+              <w:left w:w="85" w:type="dxa"/>
+              <w:bottom w:w="80" w:type="dxa"/>
+              <w:right w:w="85" w:type="dxa"/>
+            </w:tcMar>
+            <w:tcBorders>
+              <w:top w:val="single" w:sz="4" w:color="D9D9D9"/>
+              <w:left w:val="single" w:sz="4" w:color="D9D9D9"/>
+              <w:bottom w:val="single" w:sz="4" w:color="D9D9D9"/>
+              <w:right w:val="single" w:sz="4" w:color="D9D9D9"/>
+            </w:tcBorders>
+          </w:tcPr>
+          <w:p>
+            <w:pPr>
+              <w:spacing w:after="0"/>
+              <w:jc w:val="center"/>
+            </w:pPr>
+            <w:r>
+              <w:rPr>
+                <w:rFonts w:ascii="Aptos" w:hAnsi="Aptos"/>
+                <w:color w:val="000000"/>
+                <w:sz w:val="17"/>
+              </w:rPr>
+              <w:t>HLR-03</w:t>
+            </w:r>
+          </w:p>
+        </w:tc>
+        <w:tc>
+          <w:tcPr>
+            <w:tcW w:type="dxa" w:w="2952"/>
+            <w:vAlign w:val="center"/>
+            <w:tcMar>
+              <w:top w:w="80" w:type="dxa"/>
+              <w:left w:w="85" w:type="dxa"/>
+              <w:bottom w:w="80" w:type="dxa"/>
+              <w:right w:w="85" w:type="dxa"/>
+            </w:tcMar>
+            <w:tcBorders>
+              <w:top w:val="single" w:sz="4" w:color="D9D9D9"/>
+              <w:left w:val="single" w:sz="4" w:color="D9D9D9"/>
+              <w:bottom w:val="single" w:sz="4" w:color="D9D9D9"/>
+              <w:right w:val="single" w:sz="4" w:color="D9D9D9"/>
+            </w:tcBorders>
+          </w:tcPr>
+          <w:p>
+            <w:pPr>
+              <w:spacing w:after="0"/>
+            </w:pPr>
+            <w:r>
+              <w:rPr>
+                <w:rFonts w:ascii="Aptos" w:hAnsi="Aptos"/>
+                <w:color w:val="000000"/>
+                <w:sz w:val="17"/>
+              </w:rPr>
+              <w:t>Donor profiles</w:t>
+            </w:r>
+          </w:p>
+        </w:tc>
+        <w:tc>
+          <w:tcPr>
+            <w:tcW w:type="dxa" w:w="8842"/>
+            <w:vAlign w:val="center"/>
+            <w:tcMar>
+              <w:top w:w="80" w:type="dxa"/>
+              <w:left w:w="85" w:type="dxa"/>
+              <w:bottom w:w="80" w:type="dxa"/>
+              <w:right w:w="85" w:type="dxa"/>
+            </w:tcMar>
+            <w:tcBorders>
+              <w:top w:val="single" w:sz="4" w:color="D9D9D9"/>
+              <w:left w:val="single" w:sz="4" w:color="D9D9D9"/>
+              <w:bottom w:val="single" w:sz="4" w:color="D9D9D9"/>
+              <w:right w:val="single" w:sz="4" w:color="D9D9D9"/>
+            </w:tcBorders>
+          </w:tcPr>
+          <w:p>
+            <w:pPr>
+              <w:spacing w:after="0"/>
+            </w:pPr>
+            <w:r>
+              <w:rPr>
+                <w:rFonts w:ascii="Aptos" w:hAnsi="Aptos"/>
+                <w:color w:val="000000"/>
+                <w:sz w:val="17"/>
+              </w:rPr>
+              <w:t>The platform shall let receptionists find, register, and update donor profiles before starting a donation.</w:t>
+            </w:r>
+          </w:p>
+        </w:tc>
+        <w:tc>
+          <w:tcPr>
+            <w:tcW w:type="dxa" w:w="1944"/>
+            <w:vAlign w:val="center"/>
+            <w:tcMar>
+              <w:top w:w="80" w:type="dxa"/>
+              <w:left w:w="85" w:type="dxa"/>
+              <w:bottom w:w="80" w:type="dxa"/>
+              <w:right w:w="85" w:type="dxa"/>
+            </w:tcMar>
+            <w:tcBorders>
+              <w:top w:val="single" w:sz="4" w:color="D9D9D9"/>
+              <w:left w:val="single" w:sz="4" w:color="D9D9D9"/>
+              <w:bottom w:val="single" w:sz="4" w:color="D9D9D9"/>
+              <w:right w:val="single" w:sz="4" w:color="D9D9D9"/>
+            </w:tcBorders>
+          </w:tcPr>
+          <w:p>
+            <w:pPr>
+              <w:spacing w:after="0"/>
+              <w:jc w:val="center"/>
+            </w:pPr>
+            <w:r>
+              <w:rPr>
+                <w:rFonts w:ascii="Aptos" w:hAnsi="Aptos"/>
+                <w:color w:val="000000"/>
+                <w:sz w:val="17"/>
+              </w:rPr>
+              <w:t>FR-08 to FR-10</w:t>
+            </w:r>
+          </w:p>
+        </w:tc>
+      </w:tr>
+      <w:tr>
+        <w:trPr>
+          <w:cantSplit/>
+        </w:trPr>
+        <w:tc>
+          <w:tcPr>
+            <w:tcW w:type="dxa" w:w="1094"/>
+            <w:vAlign w:val="center"/>
+            <w:shd w:fill="F2F6FA"/>
+            <w:tcMar>
+              <w:top w:w="80" w:type="dxa"/>
+              <w:left w:w="85" w:type="dxa"/>
+              <w:bottom w:w="80" w:type="dxa"/>
+              <w:right w:w="85" w:type="dxa"/>
+            </w:tcMar>
+            <w:tcBorders>
+              <w:top w:val="single" w:sz="4" w:color="D9D9D9"/>
+              <w:left w:val="single" w:sz="4" w:color="D9D9D9"/>
+              <w:bottom w:val="single" w:sz="4" w:color="D9D9D9"/>
+              <w:right w:val="single" w:sz="4" w:color="D9D9D9"/>
+            </w:tcBorders>
+          </w:tcPr>
+          <w:p>
+            <w:pPr>
+              <w:spacing w:after="0"/>
+              <w:jc w:val="center"/>
+            </w:pPr>
+            <w:r>
+              <w:rPr>
+                <w:rFonts w:ascii="Aptos" w:hAnsi="Aptos"/>
+                <w:color w:val="000000"/>
+                <w:sz w:val="17"/>
+              </w:rPr>
+              <w:t>HLR-04</w:t>
+            </w:r>
+          </w:p>
+        </w:tc>
+        <w:tc>
+          <w:tcPr>
+            <w:tcW w:type="dxa" w:w="2952"/>
+            <w:vAlign w:val="center"/>
+            <w:shd w:fill="F2F6FA"/>
+            <w:tcMar>
+              <w:top w:w="80" w:type="dxa"/>
+              <w:left w:w="85" w:type="dxa"/>
+              <w:bottom w:w="80" w:type="dxa"/>
+              <w:right w:w="85" w:type="dxa"/>
+            </w:tcMar>
+            <w:tcBorders>
+              <w:top w:val="single" w:sz="4" w:color="D9D9D9"/>
+              <w:left w:val="single" w:sz="4" w:color="D9D9D9"/>
+              <w:bottom w:val="single" w:sz="4" w:color="D9D9D9"/>
+              <w:right w:val="single" w:sz="4" w:color="D9D9D9"/>
+            </w:tcBorders>
+          </w:tcPr>
+          <w:p>
+            <w:pPr>
+              <w:spacing w:after="0"/>
+            </w:pPr>
+            <w:r>
+              <w:rPr>
+                <w:rFonts w:ascii="Aptos" w:hAnsi="Aptos"/>
+                <w:color w:val="000000"/>
+                <w:sz w:val="17"/>
+              </w:rPr>
+              <w:t>Donation intake and screening</w:t>
+            </w:r>
+          </w:p>
+        </w:tc>
+        <w:tc>
+          <w:tcPr>
+            <w:tcW w:type="dxa" w:w="8842"/>
+            <w:vAlign w:val="center"/>
+            <w:shd w:fill="F2F6FA"/>
+            <w:tcMar>
+              <w:top w:w="80" w:type="dxa"/>
+              <w:left w:w="85" w:type="dxa"/>
+              <w:bottom w:w="80" w:type="dxa"/>
+              <w:right w:w="85" w:type="dxa"/>
+            </w:tcMar>
+            <w:tcBorders>
+              <w:top w:val="single" w:sz="4" w:color="D9D9D9"/>
+              <w:left w:val="single" w:sz="4" w:color="D9D9D9"/>
+              <w:bottom w:val="single" w:sz="4" w:color="D9D9D9"/>
+              <w:right w:val="single" w:sz="4" w:color="D9D9D9"/>
+            </w:tcBorders>
+          </w:tcPr>
+          <w:p>
+            <w:pPr>
+              <w:spacing w:after="0"/>
+            </w:pPr>
+            <w:r>
+              <w:rPr>
+                <w:rFonts w:ascii="Aptos" w:hAnsi="Aptos"/>
+                <w:color w:val="000000"/>
+                <w:sz w:val="17"/>
+              </w:rPr>
+              <w:t>The platform shall record donation attempts, support optional barcode visit tickets, and capture eligibility or deferral decisions.</w:t>
+            </w:r>
+          </w:p>
+        </w:tc>
+        <w:tc>
+          <w:tcPr>
+            <w:tcW w:type="dxa" w:w="1944"/>
+            <w:vAlign w:val="center"/>
+            <w:shd w:fill="F2F6FA"/>
+            <w:tcMar>
+              <w:top w:w="80" w:type="dxa"/>
+              <w:left w:w="85" w:type="dxa"/>
+              <w:bottom w:w="80" w:type="dxa"/>
+              <w:right w:w="85" w:type="dxa"/>
+            </w:tcMar>
+            <w:tcBorders>
+              <w:top w:val="single" w:sz="4" w:color="D9D9D9"/>
+              <w:left w:val="single" w:sz="4" w:color="D9D9D9"/>
+              <w:bottom w:val="single" w:sz="4" w:color="D9D9D9"/>
+              <w:right w:val="single" w:sz="4" w:color="D9D9D9"/>
+            </w:tcBorders>
+          </w:tcPr>
+          <w:p>
+            <w:pPr>
+              <w:spacing w:after="0"/>
+              <w:jc w:val="center"/>
+            </w:pPr>
+            <w:r>
+              <w:rPr>
+                <w:rFonts w:ascii="Aptos" w:hAnsi="Aptos"/>
+                <w:color w:val="000000"/>
+                <w:sz w:val="17"/>
+              </w:rPr>
+              <w:t>FR-11 to FR-13</w:t>
+            </w:r>
+          </w:p>
+        </w:tc>
+      </w:tr>
+      <w:tr>
+        <w:trPr>
+          <w:cantSplit/>
+        </w:trPr>
+        <w:tc>
+          <w:tcPr>
+            <w:tcW w:type="dxa" w:w="1094"/>
+            <w:vAlign w:val="center"/>
+            <w:tcMar>
+              <w:top w:w="80" w:type="dxa"/>
+              <w:left w:w="85" w:type="dxa"/>
+              <w:bottom w:w="80" w:type="dxa"/>
+              <w:right w:w="85" w:type="dxa"/>
+            </w:tcMar>
+            <w:tcBorders>
+              <w:top w:val="single" w:sz="4" w:color="D9D9D9"/>
+              <w:left w:val="single" w:sz="4" w:color="D9D9D9"/>
+              <w:bottom w:val="single" w:sz="4" w:color="D9D9D9"/>
+              <w:right w:val="single" w:sz="4" w:color="D9D9D9"/>
+            </w:tcBorders>
+          </w:tcPr>
+          <w:p>
+            <w:pPr>
+              <w:spacing w:after="0"/>
+              <w:jc w:val="center"/>
+            </w:pPr>
+            <w:r>
+              <w:rPr>
+                <w:rFonts w:ascii="Aptos" w:hAnsi="Aptos"/>
+                <w:color w:val="000000"/>
+                <w:sz w:val="17"/>
+              </w:rPr>
+              <w:t>HLR-05</w:t>
+            </w:r>
+          </w:p>
+        </w:tc>
+        <w:tc>
+          <w:tcPr>
+            <w:tcW w:type="dxa" w:w="2952"/>
+            <w:vAlign w:val="center"/>
+            <w:tcMar>
+              <w:top w:w="80" w:type="dxa"/>
+              <w:left w:w="85" w:type="dxa"/>
+              <w:bottom w:w="80" w:type="dxa"/>
+              <w:right w:w="85" w:type="dxa"/>
+            </w:tcMar>
+            <w:tcBorders>
+              <w:top w:val="single" w:sz="4" w:color="D9D9D9"/>
+              <w:left w:val="single" w:sz="4" w:color="D9D9D9"/>
+              <w:bottom w:val="single" w:sz="4" w:color="D9D9D9"/>
+              <w:right w:val="single" w:sz="4" w:color="D9D9D9"/>
+            </w:tcBorders>
+          </w:tcPr>
+          <w:p>
+            <w:pPr>
+              <w:spacing w:after="0"/>
+            </w:pPr>
+            <w:r>
+              <w:rPr>
+                <w:rFonts w:ascii="Aptos" w:hAnsi="Aptos"/>
+                <w:color w:val="000000"/>
+                <w:sz w:val="17"/>
+              </w:rPr>
+              <w:t>Blood collection</w:t>
+            </w:r>
+          </w:p>
+        </w:tc>
+        <w:tc>
+          <w:tcPr>
+            <w:tcW w:type="dxa" w:w="8842"/>
+            <w:vAlign w:val="center"/>
+            <w:tcMar>
+              <w:top w:w="80" w:type="dxa"/>
+              <w:left w:w="85" w:type="dxa"/>
+              <w:bottom w:w="80" w:type="dxa"/>
+              <w:right w:w="85" w:type="dxa"/>
+            </w:tcMar>
+            <w:tcBorders>
+              <w:top w:val="single" w:sz="4" w:color="D9D9D9"/>
+              <w:left w:val="single" w:sz="4" w:color="D9D9D9"/>
+              <w:bottom w:val="single" w:sz="4" w:color="D9D9D9"/>
+              <w:right w:val="single" w:sz="4" w:color="D9D9D9"/>
+            </w:tcBorders>
+          </w:tcPr>
+          <w:p>
+            <w:pPr>
+              <w:spacing w:after="0"/>
+            </w:pPr>
+            <w:r>
+              <w:rPr>
+                <w:rFonts w:ascii="Aptos" w:hAnsi="Aptos"/>
+                <w:color w:val="000000"/>
+                <w:sz w:val="17"/>
+              </w:rPr>
+              <w:t>The platform shall record the start and outcome of collection, including collected volume and reasons for unsuccessful attempts.</w:t>
+            </w:r>
+          </w:p>
+        </w:tc>
+        <w:tc>
+          <w:tcPr>
+            <w:tcW w:type="dxa" w:w="1944"/>
+            <w:vAlign w:val="center"/>
+            <w:tcMar>
+              <w:top w:w="80" w:type="dxa"/>
+              <w:left w:w="85" w:type="dxa"/>
+              <w:bottom w:w="80" w:type="dxa"/>
+              <w:right w:w="85" w:type="dxa"/>
+            </w:tcMar>
+            <w:tcBorders>
+              <w:top w:val="single" w:sz="4" w:color="D9D9D9"/>
+              <w:left w:val="single" w:sz="4" w:color="D9D9D9"/>
+              <w:bottom w:val="single" w:sz="4" w:color="D9D9D9"/>
+              <w:right w:val="single" w:sz="4" w:color="D9D9D9"/>
+            </w:tcBorders>
+          </w:tcPr>
+          <w:p>
+            <w:pPr>
+              <w:spacing w:after="0"/>
+              <w:jc w:val="center"/>
+            </w:pPr>
+            <w:r>
+              <w:rPr>
+                <w:rFonts w:ascii="Aptos" w:hAnsi="Aptos"/>
+                <w:color w:val="000000"/>
+                <w:sz w:val="17"/>
+              </w:rPr>
+              <w:t>FR-14 to FR-15</w:t>
+            </w:r>
+          </w:p>
+        </w:tc>
+      </w:tr>
+      <w:tr>
+        <w:trPr>
+          <w:cantSplit/>
+        </w:trPr>
+        <w:tc>
+          <w:tcPr>
+            <w:tcW w:type="dxa" w:w="1094"/>
+            <w:vAlign w:val="center"/>
+            <w:shd w:fill="F2F6FA"/>
+            <w:tcMar>
+              <w:top w:w="80" w:type="dxa"/>
+              <w:left w:w="85" w:type="dxa"/>
+              <w:bottom w:w="80" w:type="dxa"/>
+              <w:right w:w="85" w:type="dxa"/>
+            </w:tcMar>
+            <w:tcBorders>
+              <w:top w:val="single" w:sz="4" w:color="D9D9D9"/>
+              <w:left w:val="single" w:sz="4" w:color="D9D9D9"/>
+              <w:bottom w:val="single" w:sz="4" w:color="D9D9D9"/>
+              <w:right w:val="single" w:sz="4" w:color="D9D9D9"/>
+            </w:tcBorders>
+          </w:tcPr>
+          <w:p>
+            <w:pPr>
+              <w:spacing w:after="0"/>
+              <w:jc w:val="center"/>
+            </w:pPr>
+            <w:r>
+              <w:rPr>
+                <w:rFonts w:ascii="Aptos" w:hAnsi="Aptos"/>
+                <w:color w:val="000000"/>
+                <w:sz w:val="17"/>
+              </w:rPr>
+              <w:t>HLR-06</w:t>
+            </w:r>
+          </w:p>
+        </w:tc>
+        <w:tc>
+          <w:tcPr>
+            <w:tcW w:type="dxa" w:w="2952"/>
+            <w:vAlign w:val="center"/>
+            <w:shd w:fill="F2F6FA"/>
+            <w:tcMar>
+              <w:top w:w="80" w:type="dxa"/>
+              <w:left w:w="85" w:type="dxa"/>
+              <w:bottom w:w="80" w:type="dxa"/>
+              <w:right w:w="85" w:type="dxa"/>
+            </w:tcMar>
+            <w:tcBorders>
+              <w:top w:val="single" w:sz="4" w:color="D9D9D9"/>
+              <w:left w:val="single" w:sz="4" w:color="D9D9D9"/>
+              <w:bottom w:val="single" w:sz="4" w:color="D9D9D9"/>
+              <w:right w:val="single" w:sz="4" w:color="D9D9D9"/>
+            </w:tcBorders>
+          </w:tcPr>
+          <w:p>
+            <w:pPr>
+              <w:spacing w:after="0"/>
+            </w:pPr>
+            <w:r>
+              <w:rPr>
+                <w:rFonts w:ascii="Aptos" w:hAnsi="Aptos"/>
+                <w:color w:val="000000"/>
+                <w:sz w:val="17"/>
+              </w:rPr>
+              <w:t>Component and laboratory decisions</w:t>
+            </w:r>
+          </w:p>
+        </w:tc>
+        <w:tc>
+          <w:tcPr>
+            <w:tcW w:type="dxa" w:w="8842"/>
+            <w:vAlign w:val="center"/>
+            <w:shd w:fill="F2F6FA"/>
+            <w:tcMar>
+              <w:top w:w="80" w:type="dxa"/>
+              <w:left w:w="85" w:type="dxa"/>
+              <w:bottom w:w="80" w:type="dxa"/>
+              <w:right w:w="85" w:type="dxa"/>
+            </w:tcMar>
+            <w:tcBorders>
+              <w:top w:val="single" w:sz="4" w:color="D9D9D9"/>
+              <w:left w:val="single" w:sz="4" w:color="D9D9D9"/>
+              <w:bottom w:val="single" w:sz="4" w:color="D9D9D9"/>
+              <w:right w:val="single" w:sz="4" w:color="D9D9D9"/>
+            </w:tcBorders>
+          </w:tcPr>
+          <w:p>
+            <w:pPr>
+              <w:spacing w:after="0"/>
+            </w:pPr>
+            <w:r>
+              <w:rPr>
+                <w:rFonts w:ascii="Aptos" w:hAnsi="Aptos"/>
+                <w:color w:val="000000"/>
+                <w:sz w:val="17"/>
+              </w:rPr>
+              <w:t>The platform shall record each processed component and its acceptance or rejection, then finalize the donation’s laboratory screening outcome.</w:t>
+            </w:r>
+          </w:p>
+        </w:tc>
+        <w:tc>
+          <w:tcPr>
+            <w:tcW w:type="dxa" w:w="1944"/>
+            <w:vAlign w:val="center"/>
+            <w:shd w:fill="F2F6FA"/>
+            <w:tcMar>
+              <w:top w:w="80" w:type="dxa"/>
+              <w:left w:w="85" w:type="dxa"/>
+              <w:bottom w:w="80" w:type="dxa"/>
+              <w:right w:w="85" w:type="dxa"/>
+            </w:tcMar>
+            <w:tcBorders>
+              <w:top w:val="single" w:sz="4" w:color="D9D9D9"/>
+              <w:left w:val="single" w:sz="4" w:color="D9D9D9"/>
+              <w:bottom w:val="single" w:sz="4" w:color="D9D9D9"/>
+              <w:right w:val="single" w:sz="4" w:color="D9D9D9"/>
+            </w:tcBorders>
+          </w:tcPr>
+          <w:p>
+            <w:pPr>
+              <w:spacing w:after="0"/>
+              <w:jc w:val="center"/>
+            </w:pPr>
+            <w:r>
+              <w:rPr>
+                <w:rFonts w:ascii="Aptos" w:hAnsi="Aptos"/>
+                <w:color w:val="000000"/>
+                <w:sz w:val="17"/>
+              </w:rPr>
+              <w:t>FR-16 to FR-17</w:t>
+            </w:r>
+          </w:p>
+        </w:tc>
+      </w:tr>
+      <w:tr>
+        <w:trPr>
+          <w:cantSplit/>
+        </w:trPr>
+        <w:tc>
+          <w:tcPr>
+            <w:tcW w:type="dxa" w:w="1094"/>
+            <w:vAlign w:val="center"/>
+            <w:tcMar>
+              <w:top w:w="80" w:type="dxa"/>
+              <w:left w:w="85" w:type="dxa"/>
+              <w:bottom w:w="80" w:type="dxa"/>
+              <w:right w:w="85" w:type="dxa"/>
+            </w:tcMar>
+            <w:tcBorders>
+              <w:top w:val="single" w:sz="4" w:color="D9D9D9"/>
+              <w:left w:val="single" w:sz="4" w:color="D9D9D9"/>
+              <w:bottom w:val="single" w:sz="4" w:color="D9D9D9"/>
+              <w:right w:val="single" w:sz="4" w:color="D9D9D9"/>
+            </w:tcBorders>
+          </w:tcPr>
+          <w:p>
+            <w:pPr>
+              <w:spacing w:after="0"/>
+              <w:jc w:val="center"/>
+            </w:pPr>
+            <w:r>
+              <w:rPr>
+                <w:rFonts w:ascii="Aptos" w:hAnsi="Aptos"/>
+                <w:color w:val="000000"/>
+                <w:sz w:val="17"/>
+              </w:rPr>
+              <w:t>HLR-07</w:t>
+            </w:r>
+          </w:p>
+        </w:tc>
+        <w:tc>
+          <w:tcPr>
+            <w:tcW w:type="dxa" w:w="2952"/>
+            <w:vAlign w:val="center"/>
+            <w:tcMar>
+              <w:top w:w="80" w:type="dxa"/>
+              <w:left w:w="85" w:type="dxa"/>
+              <w:bottom w:w="80" w:type="dxa"/>
+              <w:right w:w="85" w:type="dxa"/>
+            </w:tcMar>
+            <w:tcBorders>
+              <w:top w:val="single" w:sz="4" w:color="D9D9D9"/>
+              <w:left w:val="single" w:sz="4" w:color="D9D9D9"/>
+              <w:bottom w:val="single" w:sz="4" w:color="D9D9D9"/>
+              <w:right w:val="single" w:sz="4" w:color="D9D9D9"/>
+            </w:tcBorders>
+          </w:tcPr>
+          <w:p>
+            <w:pPr>
+              <w:spacing w:after="0"/>
+            </w:pPr>
+            <w:r>
+              <w:rPr>
+                <w:rFonts w:ascii="Aptos" w:hAnsi="Aptos"/>
+                <w:color w:val="000000"/>
+                <w:sz w:val="17"/>
+              </w:rPr>
+              <w:t>Hospital requests</w:t>
+            </w:r>
+          </w:p>
+        </w:tc>
+        <w:tc>
+          <w:tcPr>
+            <w:tcW w:type="dxa" w:w="8842"/>
+            <w:vAlign w:val="center"/>
+            <w:tcMar>
+              <w:top w:w="80" w:type="dxa"/>
+              <w:left w:w="85" w:type="dxa"/>
+              <w:bottom w:w="80" w:type="dxa"/>
+              <w:right w:w="85" w:type="dxa"/>
+            </w:tcMar>
+            <w:tcBorders>
+              <w:top w:val="single" w:sz="4" w:color="D9D9D9"/>
+              <w:left w:val="single" w:sz="4" w:color="D9D9D9"/>
+              <w:bottom w:val="single" w:sz="4" w:color="D9D9D9"/>
+              <w:right w:val="single" w:sz="4" w:color="D9D9D9"/>
+            </w:tcBorders>
+          </w:tcPr>
+          <w:p>
+            <w:pPr>
+              <w:spacing w:after="0"/>
+            </w:pPr>
+            <w:r>
+              <w:rPr>
+                <w:rFonts w:ascii="Aptos" w:hAnsi="Aptos"/>
+                <w:color w:val="000000"/>
+                <w:sz w:val="17"/>
+              </w:rPr>
+              <w:t>The platform shall let hospital staff submit patient-linked requests, identify the nearest bank able to supply the complete exact-match quantity, and let inventory staff accept pending requests.</w:t>
+            </w:r>
+          </w:p>
+        </w:tc>
+        <w:tc>
+          <w:tcPr>
+            <w:tcW w:type="dxa" w:w="1944"/>
+            <w:vAlign w:val="center"/>
+            <w:tcMar>
+              <w:top w:w="80" w:type="dxa"/>
+              <w:left w:w="85" w:type="dxa"/>
+              <w:bottom w:w="80" w:type="dxa"/>
+              <w:right w:w="85" w:type="dxa"/>
+            </w:tcMar>
+            <w:tcBorders>
+              <w:top w:val="single" w:sz="4" w:color="D9D9D9"/>
+              <w:left w:val="single" w:sz="4" w:color="D9D9D9"/>
+              <w:bottom w:val="single" w:sz="4" w:color="D9D9D9"/>
+              <w:right w:val="single" w:sz="4" w:color="D9D9D9"/>
+            </w:tcBorders>
+          </w:tcPr>
+          <w:p>
+            <w:pPr>
+              <w:spacing w:after="0"/>
+              <w:jc w:val="center"/>
+            </w:pPr>
+            <w:r>
+              <w:rPr>
+                <w:rFonts w:ascii="Aptos" w:hAnsi="Aptos"/>
+                <w:color w:val="000000"/>
+                <w:sz w:val="17"/>
+              </w:rPr>
+              <w:t>FR-18 to FR-20</w:t>
+            </w:r>
+          </w:p>
+        </w:tc>
+      </w:tr>
+      <w:tr>
+        <w:trPr>
+          <w:cantSplit/>
+        </w:trPr>
+        <w:tc>
+          <w:tcPr>
+            <w:tcW w:type="dxa" w:w="1094"/>
+            <w:vAlign w:val="center"/>
+            <w:shd w:fill="F2F6FA"/>
+            <w:tcMar>
+              <w:top w:w="80" w:type="dxa"/>
+              <w:left w:w="85" w:type="dxa"/>
+              <w:bottom w:w="80" w:type="dxa"/>
+              <w:right w:w="85" w:type="dxa"/>
+            </w:tcMar>
+            <w:tcBorders>
+              <w:top w:val="single" w:sz="4" w:color="D9D9D9"/>
+              <w:left w:val="single" w:sz="4" w:color="D9D9D9"/>
+              <w:bottom w:val="single" w:sz="4" w:color="D9D9D9"/>
+              <w:right w:val="single" w:sz="4" w:color="D9D9D9"/>
+            </w:tcBorders>
+          </w:tcPr>
+          <w:p>
+            <w:pPr>
+              <w:spacing w:after="0"/>
+              <w:jc w:val="center"/>
+            </w:pPr>
+            <w:r>
+              <w:rPr>
+                <w:rFonts w:ascii="Aptos" w:hAnsi="Aptos"/>
+                <w:color w:val="000000"/>
+                <w:sz w:val="17"/>
+              </w:rPr>
+              <w:t>HLR-08</w:t>
+            </w:r>
+          </w:p>
+        </w:tc>
+        <w:tc>
+          <w:tcPr>
+            <w:tcW w:type="dxa" w:w="2952"/>
+            <w:vAlign w:val="center"/>
+            <w:shd w:fill="F2F6FA"/>
+            <w:tcMar>
+              <w:top w:w="80" w:type="dxa"/>
+              <w:left w:w="85" w:type="dxa"/>
+              <w:bottom w:w="80" w:type="dxa"/>
+              <w:right w:w="85" w:type="dxa"/>
+            </w:tcMar>
+            <w:tcBorders>
+              <w:top w:val="single" w:sz="4" w:color="D9D9D9"/>
+              <w:left w:val="single" w:sz="4" w:color="D9D9D9"/>
+              <w:bottom w:val="single" w:sz="4" w:color="D9D9D9"/>
+              <w:right w:val="single" w:sz="4" w:color="D9D9D9"/>
+            </w:tcBorders>
+          </w:tcPr>
+          <w:p>
+            <w:pPr>
+              <w:spacing w:after="0"/>
+            </w:pPr>
+            <w:r>
+              <w:rPr>
+                <w:rFonts w:ascii="Aptos" w:hAnsi="Aptos"/>
+                <w:color w:val="000000"/>
+                <w:sz w:val="17"/>
+              </w:rPr>
+              <w:t>Demand forecasting</w:t>
+            </w:r>
+          </w:p>
+        </w:tc>
+        <w:tc>
+          <w:tcPr>
+            <w:tcW w:type="dxa" w:w="8842"/>
+            <w:vAlign w:val="center"/>
+            <w:shd w:fill="F2F6FA"/>
+            <w:tcMar>
+              <w:top w:w="80" w:type="dxa"/>
+              <w:left w:w="85" w:type="dxa"/>
+              <w:bottom w:w="80" w:type="dxa"/>
+              <w:right w:w="85" w:type="dxa"/>
+            </w:tcMar>
+            <w:tcBorders>
+              <w:top w:val="single" w:sz="4" w:color="D9D9D9"/>
+              <w:left w:val="single" w:sz="4" w:color="D9D9D9"/>
+              <w:bottom w:val="single" w:sz="4" w:color="D9D9D9"/>
+              <w:right w:val="single" w:sz="4" w:color="D9D9D9"/>
+            </w:tcBorders>
+          </w:tcPr>
+          <w:p>
+            <w:pPr>
+              <w:spacing w:after="0"/>
+            </w:pPr>
+            <w:r>
+              <w:rPr>
+                <w:rFonts w:ascii="Aptos" w:hAnsi="Aptos"/>
+                <w:color w:val="000000"/>
+                <w:sz w:val="17"/>
+              </w:rPr>
+              <w:t>The platform shall generate demand forecasts by component and ABO/Rh group and make saved forecasts available to bank administrators.</w:t>
+            </w:r>
+          </w:p>
+        </w:tc>
+        <w:tc>
+          <w:tcPr>
+            <w:tcW w:type="dxa" w:w="1944"/>
+            <w:vAlign w:val="center"/>
+            <w:shd w:fill="F2F6FA"/>
+            <w:tcMar>
+              <w:top w:w="80" w:type="dxa"/>
+              <w:left w:w="85" w:type="dxa"/>
+              <w:bottom w:w="80" w:type="dxa"/>
+              <w:right w:w="85" w:type="dxa"/>
+            </w:tcMar>
+            <w:tcBorders>
+              <w:top w:val="single" w:sz="4" w:color="D9D9D9"/>
+              <w:left w:val="single" w:sz="4" w:color="D9D9D9"/>
+              <w:bottom w:val="single" w:sz="4" w:color="D9D9D9"/>
+              <w:right w:val="single" w:sz="4" w:color="D9D9D9"/>
+            </w:tcBorders>
+          </w:tcPr>
+          <w:p>
+            <w:pPr>
+              <w:spacing w:after="0"/>
+              <w:jc w:val="center"/>
+            </w:pPr>
+            <w:r>
+              <w:rPr>
+                <w:rFonts w:ascii="Aptos" w:hAnsi="Aptos"/>
+                <w:color w:val="000000"/>
+                <w:sz w:val="17"/>
+              </w:rPr>
+              <w:t>FR-21 to FR-22</w:t>
+            </w:r>
+          </w:p>
+        </w:tc>
+      </w:tr>
+      <w:tr>
+        <w:trPr>
+          <w:cantSplit/>
+        </w:trPr>
+        <w:tc>
+          <w:tcPr>
+            <w:tcW w:type="dxa" w:w="1094"/>
+            <w:vAlign w:val="center"/>
+            <w:tcMar>
+              <w:top w:w="80" w:type="dxa"/>
+              <w:left w:w="85" w:type="dxa"/>
+              <w:bottom w:w="80" w:type="dxa"/>
+              <w:right w:w="85" w:type="dxa"/>
+            </w:tcMar>
+            <w:tcBorders>
+              <w:top w:val="single" w:sz="4" w:color="D9D9D9"/>
+              <w:left w:val="single" w:sz="4" w:color="D9D9D9"/>
+              <w:bottom w:val="single" w:sz="4" w:color="D9D9D9"/>
+              <w:right w:val="single" w:sz="4" w:color="D9D9D9"/>
+            </w:tcBorders>
+          </w:tcPr>
+          <w:p>
+            <w:pPr>
+              <w:spacing w:after="0"/>
+              <w:jc w:val="center"/>
+            </w:pPr>
+            <w:r>
+              <w:rPr>
+                <w:rFonts w:ascii="Aptos" w:hAnsi="Aptos"/>
+                <w:color w:val="000000"/>
+                <w:sz w:val="17"/>
+              </w:rPr>
+              <w:t>HLR-09</w:t>
+            </w:r>
+          </w:p>
+        </w:tc>
+        <w:tc>
+          <w:tcPr>
+            <w:tcW w:type="dxa" w:w="2952"/>
+            <w:vAlign w:val="center"/>
+            <w:tcMar>
+              <w:top w:w="80" w:type="dxa"/>
+              <w:left w:w="85" w:type="dxa"/>
+              <w:bottom w:w="80" w:type="dxa"/>
+              <w:right w:w="85" w:type="dxa"/>
+            </w:tcMar>
+            <w:tcBorders>
+              <w:top w:val="single" w:sz="4" w:color="D9D9D9"/>
+              <w:left w:val="single" w:sz="4" w:color="D9D9D9"/>
+              <w:bottom w:val="single" w:sz="4" w:color="D9D9D9"/>
+              <w:right w:val="single" w:sz="4" w:color="D9D9D9"/>
+            </w:tcBorders>
+          </w:tcPr>
+          <w:p>
+            <w:pPr>
+              <w:spacing w:after="0"/>
+            </w:pPr>
+            <w:r>
+              <w:rPr>
+                <w:rFonts w:ascii="Aptos" w:hAnsi="Aptos"/>
+                <w:color w:val="000000"/>
+                <w:sz w:val="17"/>
+              </w:rPr>
+              <w:t>Expiry and disposal</w:t>
+            </w:r>
+          </w:p>
+        </w:tc>
+        <w:tc>
+          <w:tcPr>
+            <w:tcW w:type="dxa" w:w="8842"/>
+            <w:vAlign w:val="center"/>
+            <w:tcMar>
+              <w:top w:w="80" w:type="dxa"/>
+              <w:left w:w="85" w:type="dxa"/>
+              <w:bottom w:w="80" w:type="dxa"/>
+              <w:right w:w="85" w:type="dxa"/>
+            </w:tcMar>
+            <w:tcBorders>
+              <w:top w:val="single" w:sz="4" w:color="D9D9D9"/>
+              <w:left w:val="single" w:sz="4" w:color="D9D9D9"/>
+              <w:bottom w:val="single" w:sz="4" w:color="D9D9D9"/>
+              <w:right w:val="single" w:sz="4" w:color="D9D9D9"/>
+            </w:tcBorders>
+          </w:tcPr>
+          <w:p>
+            <w:pPr>
+              <w:spacing w:after="0"/>
+            </w:pPr>
+            <w:r>
+              <w:rPr>
+                <w:rFonts w:ascii="Aptos" w:hAnsi="Aptos"/>
+                <w:color w:val="000000"/>
+                <w:sz w:val="17"/>
+              </w:rPr>
+              <w:t>The platform shall notify inventory staff about expired components and record their physical disposal, responsible staff member, and time.</w:t>
+            </w:r>
+          </w:p>
+        </w:tc>
+        <w:tc>
+          <w:tcPr>
+            <w:tcW w:type="dxa" w:w="1944"/>
+            <w:vAlign w:val="center"/>
+            <w:tcMar>
+              <w:top w:w="80" w:type="dxa"/>
+              <w:left w:w="85" w:type="dxa"/>
+              <w:bottom w:w="80" w:type="dxa"/>
+              <w:right w:w="85" w:type="dxa"/>
+            </w:tcMar>
+            <w:tcBorders>
+              <w:top w:val="single" w:sz="4" w:color="D9D9D9"/>
+              <w:left w:val="single" w:sz="4" w:color="D9D9D9"/>
+              <w:bottom w:val="single" w:sz="4" w:color="D9D9D9"/>
+              <w:right w:val="single" w:sz="4" w:color="D9D9D9"/>
+            </w:tcBorders>
+          </w:tcPr>
+          <w:p>
+            <w:pPr>
+              <w:spacing w:after="0"/>
+              <w:jc w:val="center"/>
+            </w:pPr>
+            <w:r>
+              <w:rPr>
+                <w:rFonts w:ascii="Aptos" w:hAnsi="Aptos"/>
+                <w:color w:val="000000"/>
+                <w:sz w:val="17"/>
+              </w:rPr>
+              <w:t>FR-23 to FR-24</w:t>
+            </w:r>
+          </w:p>
+        </w:tc>
+      </w:tr>
+    </w:tbl>
+    <w:p>
+      <w:pPr>
+        <w:pStyle w:val="Heading1"/>
+        <w:keepNext/>
+        <w:pageBreakBefore w:val="0"/>
+        <w:spacing w:after="160" w:before="320"/>
       </w:pPr>
       <w:r>
         <w:lastRenderedPageBreak/>

</xml_diff>